<commit_message>
week 4: update Week 4 Report.docx with latest edits
[skip ci]

Co-Authored-By: Claude Opus 4.7 (1M context) <noreply@anthropic.com>
</commit_message>
<xml_diff>
--- a/week4/Week 4 Report.docx
+++ b/week4/Week 4 Report.docx
@@ -3,11 +3,16 @@
 <w:document xmlns:wpc="http://schemas.microsoft.com/office/word/2010/wordprocessingCanvas" xmlns:cx="http://schemas.microsoft.com/office/drawing/2014/chartex" xmlns:cx1="http://schemas.microsoft.com/office/drawing/2015/9/8/chartex" xmlns:cx2="http://schemas.microsoft.com/office/drawing/2015/10/21/chartex" xmlns:cx3="http://schemas.microsoft.com/office/drawing/2016/5/9/chartex" xmlns:cx4="http://schemas.microsoft.com/office/drawing/2016/5/10/chartex" xmlns:cx5="http://schemas.microsoft.com/office/drawing/2016/5/11/chartex" xmlns:cx6="http://schemas.microsoft.com/office/drawing/2016/5/12/chartex" xmlns:cx7="http://schemas.microsoft.com/office/drawing/2016/5/13/chartex" xmlns:cx8="http://schemas.microsoft.com/office/drawing/2016/5/14/chartex" xmlns:mc="http://schemas.openxmlformats.org/markup-compatibility/2006" xmlns:aink="http://schemas.microsoft.com/office/drawing/2016/ink" xmlns:am3d="http://schemas.microsoft.com/office/drawing/2017/model3d" xmlns:o="urn:schemas-microsoft-com:office:office" xmlns:oel="http://schemas.microsoft.com/office/2019/extlst" xmlns:r="http://schemas.openxmlformats.org/officeDocument/2006/relationships" xmlns:m="http://schemas.openxmlformats.org/officeDocument/2006/math" xmlns:v="urn:schemas-microsoft-com:vml" xmlns:wp14="http://schemas.microsoft.com/office/word/2010/wordprocessingDrawing" xmlns:wp="http://schemas.openxmlformats.org/drawingml/2006/wordprocessingDrawing" xmlns:w10="urn:schemas-microsoft-com:office:word" xmlns:w="http://schemas.openxmlformats.org/wordprocessingml/2006/main" xmlns:w14="http://schemas.microsoft.com/office/word/2010/wordml" xmlns:w15="http://schemas.microsoft.com/office/word/2012/wordml" xmlns:w16cex="http://schemas.microsoft.com/office/word/2018/wordml/cex" xmlns:w16cid="http://schemas.microsoft.com/office/word/2016/wordml/cid" xmlns:w16="http://schemas.microsoft.com/office/word/2018/wordml" xmlns:w16du="http://schemas.microsoft.com/office/word/2023/wordml/word16du" xmlns:w16sdtdh="http://schemas.microsoft.com/office/word/2020/wordml/sdtdatahash" xmlns:w16sdtfl="http://schemas.microsoft.com/office/word/2024/wordml/sdtformatlock" xmlns:w16se="http://schemas.microsoft.com/office/word/2015/wordml/symex" xmlns:wpg="http://schemas.microsoft.com/office/word/2010/wordprocessingGroup" xmlns:wpi="http://schemas.microsoft.com/office/word/2010/wordprocessingInk" xmlns:wne="http://schemas.microsoft.com/office/word/2006/wordml" xmlns:wps="http://schemas.microsoft.com/office/word/2010/wordprocessingShape" mc:Ignorable="w14 w15 w16se w16cid w16 w16cex w16sdtdh w16sdtfl w16du wp14">
   <w:body>
     <w:p>
-      <w:r>
-        <w:t>0</w:t>
-      </w:r>
+      <w:pPr>
+        <w:jc w:val="center"/>
+      </w:pPr>
       <w:r>
         <w:t>Week 4 Report</w:t>
+      </w:r>
+    </w:p>
+    <w:p>
+      <w:r>
+        <w:t>Dominic Tanzillo</w:t>
       </w:r>
     </w:p>
     <w:p>
@@ -260,7 +265,15 @@
           </w:tcPr>
           <w:p>
             <w:r>
-              <w:t>Per-zone x per-borough x (borough x is_weekend)</w:t>
+              <w:t xml:space="preserve">Per-zone x per-borough x (borough x </w:t>
+            </w:r>
+            <w:proofErr w:type="spellStart"/>
+            <w:r>
+              <w:t>is_weekend</w:t>
+            </w:r>
+            <w:proofErr w:type="spellEnd"/>
+            <w:r>
+              <w:t>)</w:t>
             </w:r>
           </w:p>
         </w:tc>
@@ -305,7 +318,39 @@
               <w:t>Per-column null rate</w:t>
             </w:r>
             <w:r>
-              <w:t xml:space="preserve"> on: trip_count, PULocationID, time_bucket, all lag fea</w:t>
+              <w:t xml:space="preserve"> </w:t>
+            </w:r>
+            <w:proofErr w:type="gramStart"/>
+            <w:r>
+              <w:t>on:</w:t>
+            </w:r>
+            <w:proofErr w:type="gramEnd"/>
+            <w:r>
+              <w:t xml:space="preserve"> </w:t>
+            </w:r>
+            <w:proofErr w:type="spellStart"/>
+            <w:r>
+              <w:t>trip_count</w:t>
+            </w:r>
+            <w:proofErr w:type="spellEnd"/>
+            <w:r>
+              <w:t xml:space="preserve">, </w:t>
+            </w:r>
+            <w:proofErr w:type="spellStart"/>
+            <w:r>
+              <w:t>PULocationID</w:t>
+            </w:r>
+            <w:proofErr w:type="spellEnd"/>
+            <w:r>
+              <w:t xml:space="preserve">, </w:t>
+            </w:r>
+            <w:proofErr w:type="spellStart"/>
+            <w:r>
+              <w:t>time_bucket</w:t>
+            </w:r>
+            <w:proofErr w:type="spellEnd"/>
+            <w:r>
+              <w:t>, all lag fea</w:t>
             </w:r>
             <w:r>
               <w:t>t</w:t>
@@ -317,8 +362,13 @@
               <w:t>r</w:t>
             </w:r>
             <w:r>
-              <w:t>es, and is_holiday</w:t>
-            </w:r>
+              <w:t xml:space="preserve">es, and </w:t>
+            </w:r>
+            <w:proofErr w:type="spellStart"/>
+            <w:r>
+              <w:t>is_holiday</w:t>
+            </w:r>
+            <w:proofErr w:type="spellEnd"/>
           </w:p>
         </w:tc>
         <w:tc>
@@ -397,8 +447,13 @@
           </w:tcPr>
           <w:p>
             <w:r>
-              <w:t>Two-sample KS on trip_count</w:t>
-            </w:r>
+              <w:t xml:space="preserve">Two-sample KS on </w:t>
+            </w:r>
+            <w:proofErr w:type="spellStart"/>
+            <w:r>
+              <w:t>trip_count</w:t>
+            </w:r>
+            <w:proofErr w:type="spellEnd"/>
           </w:p>
         </w:tc>
         <w:tc>
@@ -480,11 +535,19 @@
           </w:tcPr>
           <w:p>
             <w:r>
-              <w:t xml:space="preserve">Population Stability Index split into 10 bins for a sum of: trip_count, </w:t>
+              <w:t xml:space="preserve">Population Stability Index split into 10 bins for a sum </w:t>
             </w:r>
             <w:r>
               <w:lastRenderedPageBreak/>
-              <w:t>lag1_day, lag_1week, and roll_mean_1day</w:t>
+              <w:t xml:space="preserve">of: </w:t>
+            </w:r>
+            <w:proofErr w:type="spellStart"/>
+            <w:r>
+              <w:t>trip_count</w:t>
+            </w:r>
+            <w:proofErr w:type="spellEnd"/>
+            <w:r>
+              <w:t>, lag1_day, lag_1week, and roll_mean_1day</w:t>
             </w:r>
           </w:p>
         </w:tc>
@@ -726,7 +789,23 @@
           </w:tcPr>
           <w:p>
             <w:r>
-              <w:t xml:space="preserve">Duplicate detections on (PULocation, time_bucket) tuples </w:t>
+              <w:t>Duplicate detections on (</w:t>
+            </w:r>
+            <w:proofErr w:type="spellStart"/>
+            <w:r>
+              <w:t>PULocation</w:t>
+            </w:r>
+            <w:proofErr w:type="spellEnd"/>
+            <w:r>
+              <w:t xml:space="preserve">, </w:t>
+            </w:r>
+            <w:proofErr w:type="spellStart"/>
+            <w:r>
+              <w:t>time_bucket</w:t>
+            </w:r>
+            <w:proofErr w:type="spellEnd"/>
+            <w:r>
+              <w:t xml:space="preserve">) tuples </w:t>
             </w:r>
           </w:p>
         </w:tc>
@@ -994,8 +1073,13 @@
         </w:numPr>
       </w:pPr>
       <w:r>
-        <w:t>T+2h: Train LightGBM</w:t>
-      </w:r>
+        <w:t xml:space="preserve">T+2h: Train </w:t>
+      </w:r>
+      <w:proofErr w:type="spellStart"/>
+      <w:r>
+        <w:t>LightGBM</w:t>
+      </w:r>
+      <w:proofErr w:type="spellEnd"/>
       <w:r>
         <w:t xml:space="preserve"> from a frozen window of the last 7 days</w:t>
       </w:r>
@@ -1124,7 +1208,13 @@
     </w:p>
     <w:p>
       <w:r>
-        <w:t>For each of the following triggers, there needs to be two consecutive triggers in the data pipeline to trigger a retraining. Before the retraining, a critical alert opens an Issue on the GitHub which ensures I am notified of the error. The second consecutive critical error begins the ret</w:t>
+        <w:t xml:space="preserve">For each of the following triggers, there needs to be two consecutive triggers in the data pipeline to trigger a retraining. Before the retraining, a critical alert opens an Issue on the GitHub which ensures I am notified of the error. The second consecutive critical error </w:t>
+      </w:r>
+      <w:r>
+        <w:t>begins with</w:t>
+      </w:r>
+      <w:r>
+        <w:t xml:space="preserve"> the ret</w:t>
       </w:r>
       <w:r>
         <w:t>r</w:t>

</xml_diff>